<commit_message>
deploy: execute AWS EC2 deployment with detailed guide
</commit_message>
<xml_diff>
--- a/docs/respuesta-tecnica.docx
+++ b/docs/respuesta-tecnica.docx
@@ -3087,50 +3087,6 @@
           </w:p>
         </w:tc>
       </w:tr>
-      <w:tr>
-        <w:tc>
-          <w:tcPr>
-            <w:tcW w:type="dxa" w:w="3324"/>
-          </w:tcPr>
-          <w:p>
-            <w:r>
-              <w:rPr>
-                <w:rFonts w:ascii="Arial" w:hAnsi="Arial"/>
-                <w:sz w:val="18"/>
-              </w:rPr>
-              <w:t>2</w:t>
-            </w:r>
-          </w:p>
-        </w:tc>
-        <w:tc>
-          <w:tcPr>
-            <w:tcW w:type="dxa" w:w="3324"/>
-          </w:tcPr>
-          <w:p>
-            <w:r>
-              <w:rPr>
-                <w:rFonts w:ascii="Arial" w:hAnsi="Arial"/>
-                <w:sz w:val="18"/>
-              </w:rPr>
-              <w:t>Propuesta de base de datos (Epic 7.2)</w:t>
-            </w:r>
-          </w:p>
-        </w:tc>
-        <w:tc>
-          <w:tcPr>
-            <w:tcW w:type="dxa" w:w="3324"/>
-          </w:tcPr>
-          <w:p>
-            <w:r>
-              <w:rPr>
-                <w:rFonts w:ascii="Arial" w:hAnsi="Arial"/>
-                <w:sz w:val="18"/>
-              </w:rPr>
-              <w:t>Pendiente — tarea opcional adicional</w:t>
-            </w:r>
-          </w:p>
-        </w:tc>
-      </w:tr>
     </w:tbl>
     <w:p/>
     <w:p>
@@ -3479,6 +3435,728 @@
         <w:t>Infraestructura: Docker Compose con dos servicios independientes (backend:3000, frontend:5173). Red bridge para comunicacion entre contenedores. Volumes para hot-reload en desarrollo.</w:t>
       </w:r>
     </w:p>
+    <w:p>
+      <w:pPr>
+        <w:pStyle w:val="Heading1"/>
+      </w:pPr>
+      <w:r>
+        <w:rPr>
+          <w:rFonts w:ascii="Arial" w:hAnsi="Arial"/>
+          <w:color w:val="1A1A2E"/>
+          <w:sz w:val="28"/>
+        </w:rPr>
+        <w:t>11. Propuesta de base de datos (Adicional 2)</w:t>
+      </w:r>
+    </w:p>
+    <w:p>
+      <w:pPr>
+        <w:spacing w:after="80" w:before="0"/>
+      </w:pPr>
+      <w:r>
+        <w:rPr>
+          <w:rFonts w:ascii="Arial" w:hAnsi="Arial"/>
+          <w:b w:val="0"/>
+          <w:sz w:val="20"/>
+        </w:rPr>
+        <w:t>Se elaboro una propuesta completa de migracion de la persistencia actual (JSON files) a una base de datos relacional PostgreSQL 17 con Prisma ORM. El documento completo esta disponible en docs/propuesta-base-datos.md e incluye:</w:t>
+      </w:r>
+    </w:p>
+    <w:p>
+      <w:pPr>
+        <w:pStyle w:val="ListBullet"/>
+      </w:pPr>
+      <w:r>
+        <w:rPr>
+          <w:rFonts w:ascii="Arial" w:hAnsi="Arial"/>
+          <w:sz w:val="20"/>
+        </w:rPr>
+        <w:t>Seleccion de PostgreSQL 17 con justificacion tecnica (MVCC, tipos ricos, UUID nativo, JSONB)</w:t>
+      </w:r>
+    </w:p>
+    <w:p>
+      <w:pPr>
+        <w:pStyle w:val="ListBullet"/>
+      </w:pPr>
+      <w:r>
+        <w:rPr>
+          <w:rFonts w:ascii="Arial" w:hAnsi="Arial"/>
+          <w:sz w:val="20"/>
+        </w:rPr>
+        <w:t>Seleccion de Prisma 6 como ORM (generacion automatica de tipos TypeScript, migraciones, Prisma Studio)</w:t>
+      </w:r>
+    </w:p>
+    <w:p>
+      <w:pPr>
+        <w:pStyle w:val="ListBullet"/>
+      </w:pPr>
+      <w:r>
+        <w:rPr>
+          <w:rFonts w:ascii="Arial" w:hAnsi="Arial"/>
+          <w:sz w:val="20"/>
+        </w:rPr>
+        <w:t>Schema completo con 6 tablas: users, sessions, transactions, snails, races, bets</w:t>
+      </w:r>
+    </w:p>
+    <w:p>
+      <w:pPr>
+        <w:pStyle w:val="ListBullet"/>
+      </w:pPr>
+      <w:r>
+        <w:rPr>
+          <w:rFonts w:ascii="Arial" w:hAnsi="Arial"/>
+          <w:sz w:val="20"/>
+        </w:rPr>
+        <w:t>Diagrama entidad-relacion y CREATE TABLEs con indices optimizados</w:t>
+      </w:r>
+    </w:p>
+    <w:p>
+      <w:pPr>
+        <w:pStyle w:val="ListBullet"/>
+      </w:pPr>
+      <w:r>
+        <w:rPr>
+          <w:rFonts w:ascii="Arial" w:hAnsi="Arial"/>
+          <w:sz w:val="20"/>
+        </w:rPr>
+        <w:t>Queries de ejemplo para login, dashboard (graficas), y operaciones de negocio</w:t>
+      </w:r>
+    </w:p>
+    <w:p>
+      <w:pPr>
+        <w:pStyle w:val="ListBullet"/>
+      </w:pPr>
+      <w:r>
+        <w:rPr>
+          <w:rFonts w:ascii="Arial" w:hAnsi="Arial"/>
+          <w:sz w:val="20"/>
+        </w:rPr>
+        <w:t>Schema de Prisma (schema.prisma) con modelos y relaciones</w:t>
+      </w:r>
+    </w:p>
+    <w:p>
+      <w:pPr>
+        <w:pStyle w:val="ListBullet"/>
+      </w:pPr>
+      <w:r>
+        <w:rPr>
+          <w:rFonts w:ascii="Arial" w:hAnsi="Arial"/>
+          <w:sz w:val="20"/>
+        </w:rPr>
+        <w:t>Comparacion de codigo: implementacion actual (JSON) vs propuesta (Prisma)</w:t>
+      </w:r>
+    </w:p>
+    <w:p>
+      <w:pPr>
+        <w:pStyle w:val="ListBullet"/>
+      </w:pPr>
+      <w:r>
+        <w:rPr>
+          <w:rFonts w:ascii="Arial" w:hAnsi="Arial"/>
+          <w:sz w:val="20"/>
+        </w:rPr>
+        <w:t>Plan de migraciones y seed de datos iniciales</w:t>
+      </w:r>
+    </w:p>
+    <w:p>
+      <w:pPr>
+        <w:pStyle w:val="ListBullet"/>
+      </w:pPr>
+      <w:r>
+        <w:rPr>
+          <w:rFonts w:ascii="Arial" w:hAnsi="Arial"/>
+          <w:sz w:val="20"/>
+        </w:rPr>
+        <w:t>Impacto en el frontend: minimo (solo cambiar llamadas a API que ya existen)</w:t>
+      </w:r>
+    </w:p>
+    <w:p>
+      <w:pPr>
+        <w:spacing w:after="80" w:before="0"/>
+      </w:pPr>
+      <w:r>
+        <w:rPr>
+          <w:rFonts w:ascii="Arial" w:hAnsi="Arial"/>
+          <w:b w:val="0"/>
+          <w:sz w:val="20"/>
+        </w:rPr>
+        <w:t>Fundamento teorico: Normalizacion hasta 3FN (Codd, 1972), aislamiento SERIALIZABLE con MVCC (Bernstein et al., 1987), complejidad O(log n) de indices B-tree (Knuth, 1998). Patron Data Mapper (Fowler, 2002) en lugar de Active Record para mejor separacion de preocupaciones.</w:t>
+      </w:r>
+    </w:p>
+    <w:p>
+      <w:pPr>
+        <w:pStyle w:val="Heading1"/>
+      </w:pPr>
+      <w:r>
+        <w:t>Deploy en Produccion</w:t>
+      </w:r>
+    </w:p>
+    <w:p>
+      <w:r>
+        <w:t>La aplicacion fue deployada exitosamente en AWS EC2 Free Tier con costo $0/mes. El deploy se realizo el 2026-10-02 y esta disponible en https://snail.peracles.dev</w:t>
+      </w:r>
+    </w:p>
+    <w:p>
+      <w:pPr>
+        <w:pStyle w:val="Heading2"/>
+      </w:pPr>
+      <w:r>
+        <w:t>Arquitectura de Deploy</w:t>
+      </w:r>
+    </w:p>
+    <w:p>
+      <w:r>
+        <w:t>Internet → Cloudflare DNS → EC2 t3.micro (Ubuntu 24.04)</w:t>
+        <w:br/>
+        <w:t xml:space="preserve">  ├─ Nginx :80/:443</w:t>
+        <w:br/>
+        <w:t xml:space="preserve">  │   ├─ /          → static files (vite build output)</w:t>
+        <w:br/>
+        <w:t xml:space="preserve">  └─ /api/*     → proxy_pass http://localhost:3000</w:t>
+        <w:br/>
+        <w:t xml:space="preserve">  └─ PM2 + Node.js :3000 (Express backend)</w:t>
+        <w:br/>
+        <w:t xml:space="preserve">      └─ JSON files (users.json, sessions.json)</w:t>
+      </w:r>
+    </w:p>
+    <w:p>
+      <w:pPr>
+        <w:pStyle w:val="Heading2"/>
+      </w:pPr>
+      <w:r>
+        <w:t>Decisiones Tecnicas</w:t>
+      </w:r>
+    </w:p>
+    <w:tbl>
+      <w:tblPr>
+        <w:tblStyle w:val="TableGrid"/>
+        <w:tblW w:type="auto" w:w="0"/>
+        <w:tblLook w:firstColumn="1" w:firstRow="1" w:lastColumn="0" w:lastRow="0" w:noHBand="0" w:noVBand="1" w:val="04A0"/>
+      </w:tblPr>
+      <w:tblGrid>
+        <w:gridCol w:w="3324"/>
+        <w:gridCol w:w="3324"/>
+        <w:gridCol w:w="3324"/>
+      </w:tblGrid>
+      <w:tr>
+        <w:tc>
+          <w:tcPr>
+            <w:tcW w:type="dxa" w:w="3324"/>
+          </w:tcPr>
+          <w:p>
+            <w:r>
+              <w:t>Decision</w:t>
+            </w:r>
+          </w:p>
+        </w:tc>
+        <w:tc>
+          <w:tcPr>
+            <w:tcW w:type="dxa" w:w="3324"/>
+          </w:tcPr>
+          <w:p>
+            <w:r>
+              <w:t>Justificacion</w:t>
+            </w:r>
+          </w:p>
+        </w:tc>
+        <w:tc>
+          <w:tcPr>
+            <w:tcW w:type="dxa" w:w="3324"/>
+          </w:tcPr>
+          <w:p>
+            <w:r>
+              <w:t>Alternativas Descartadas</w:t>
+            </w:r>
+          </w:p>
+        </w:tc>
+      </w:tr>
+      <w:tr>
+        <w:tc>
+          <w:tcPr>
+            <w:tcW w:type="dxa" w:w="3324"/>
+          </w:tcPr>
+          <w:p>
+            <w:r>
+              <w:t>EC2 t3.micro</w:t>
+            </w:r>
+          </w:p>
+        </w:tc>
+        <w:tc>
+          <w:tcPr>
+            <w:tcW w:type="dxa" w:w="3324"/>
+          </w:tcPr>
+          <w:p>
+            <w:r>
+              <w:t>Free Tier (750 hrs/mes, 12 meses), 2 vCPU, 1 GB RAM</w:t>
+            </w:r>
+          </w:p>
+        </w:tc>
+        <w:tc>
+          <w:tcPr>
+            <w:tcW w:type="dxa" w:w="3324"/>
+          </w:tcPr>
+          <w:p>
+            <w:r>
+              <w:t>t2.micro (ya no disponible en Free Tier), Vercel+Railway (costos ocultos), Render (limitado)</w:t>
+            </w:r>
+          </w:p>
+        </w:tc>
+      </w:tr>
+      <w:tr>
+        <w:tc>
+          <w:tcPr>
+            <w:tcW w:type="dxa" w:w="3324"/>
+          </w:tcPr>
+          <w:p>
+            <w:r>
+              <w:t>Nginx reverse proxy</w:t>
+            </w:r>
+          </w:p>
+        </w:tc>
+        <w:tc>
+          <w:tcPr>
+            <w:tcW w:type="dxa" w:w="3324"/>
+          </w:tcPr>
+          <w:p>
+            <w:r>
+              <w:t>Patron reactor O(1) por evento, eficiente para Node.js, SSL termination</w:t>
+            </w:r>
+          </w:p>
+        </w:tc>
+        <w:tc>
+          <w:tcPr>
+            <w:tcW w:type="dxa" w:w="3324"/>
+          </w:tcPr>
+          <w:p>
+            <w:r>
+              <w:t>Apache (modelo por conexion menos eficiente), Caddy (menos documentado)</w:t>
+            </w:r>
+          </w:p>
+        </w:tc>
+      </w:tr>
+      <w:tr>
+        <w:tc>
+          <w:tcPr>
+            <w:tcW w:type="dxa" w:w="3324"/>
+          </w:tcPr>
+          <w:p>
+            <w:r>
+              <w:t>PM2 process manager</w:t>
+            </w:r>
+          </w:p>
+        </w:tc>
+        <w:tc>
+          <w:tcPr>
+            <w:tcW w:type="dxa" w:w="3324"/>
+          </w:tcPr>
+          <w:p>
+            <w:r>
+              <w:t>Auto-restart, log management, zero-downtime restarts, startup scripts</w:t>
+            </w:r>
+          </w:p>
+        </w:tc>
+        <w:tc>
+          <w:tcPr>
+            <w:tcW w:type="dxa" w:w="3324"/>
+          </w:tcPr>
+          <w:p>
+            <w:r>
+              <w:t>systemd directo (mas complejo), forever (menos mantenido), nodemon (solo dev)</w:t>
+            </w:r>
+          </w:p>
+        </w:tc>
+      </w:tr>
+      <w:tr>
+        <w:tc>
+          <w:tcPr>
+            <w:tcW w:type="dxa" w:w="3324"/>
+          </w:tcPr>
+          <w:p>
+            <w:r>
+              <w:t>Let's Encrypt SSL</w:t>
+            </w:r>
+          </w:p>
+        </w:tc>
+        <w:tc>
+          <w:tcPr>
+            <w:tcW w:type="dxa" w:w="3324"/>
+          </w:tcPr>
+          <w:p>
+            <w:r>
+              <w:t>Gratuito, automatizado, reconocido por navegadores, renovacion automatica</w:t>
+            </w:r>
+          </w:p>
+        </w:tc>
+        <w:tc>
+          <w:tcPr>
+            <w:tcW w:type="dxa" w:w="3324"/>
+          </w:tcPr>
+          <w:p>
+            <w:r>
+              <w:t>Certificado autofirmado (advertencia seguridad), Cloudflare SSL (requiere proxy)</w:t>
+            </w:r>
+          </w:p>
+        </w:tc>
+      </w:tr>
+      <w:tr>
+        <w:tc>
+          <w:tcPr>
+            <w:tcW w:type="dxa" w:w="3324"/>
+          </w:tcPr>
+          <w:p>
+            <w:r>
+              <w:t>Subdominio snail.peracles.dev</w:t>
+            </w:r>
+          </w:p>
+        </w:tc>
+        <w:tc>
+          <w:tcPr>
+            <w:tcW w:type="dxa" w:w="3324"/>
+          </w:tcPr>
+          <w:p>
+            <w:r>
+              <w:t>No interfiere con landing page existente, subdominios son gratis</w:t>
+            </w:r>
+          </w:p>
+        </w:tc>
+        <w:tc>
+          <w:tcPr>
+            <w:tcW w:type="dxa" w:w="3324"/>
+          </w:tcPr>
+          <w:p>
+            <w:r>
+              <w:t>Dominio raiz (tiene landing page), path-based routing (mas complejo)</w:t>
+            </w:r>
+          </w:p>
+        </w:tc>
+      </w:tr>
+      <w:tr>
+        <w:tc>
+          <w:tcPr>
+            <w:tcW w:type="dxa" w:w="3324"/>
+          </w:tcPr>
+          <w:p>
+            <w:r>
+              <w:t>Cloudflare DNS</w:t>
+            </w:r>
+          </w:p>
+        </w:tc>
+        <w:tc>
+          <w:tcPr>
+            <w:tcW w:type="dxa" w:w="3324"/>
+          </w:tcPr>
+          <w:p>
+            <w:r>
+              <w:t>Gratis, rapido, proteccion DDoS opcional</w:t>
+            </w:r>
+          </w:p>
+        </w:tc>
+        <w:tc>
+          <w:tcPr>
+            <w:tcW w:type="dxa" w:w="3324"/>
+          </w:tcPr>
+          <w:p>
+            <w:r>
+              <w:t>Route 53 (costo minimo), Google Cloud DNS (costo minimo)</w:t>
+            </w:r>
+          </w:p>
+        </w:tc>
+      </w:tr>
+    </w:tbl>
+    <w:p/>
+    <w:p>
+      <w:pPr>
+        <w:pStyle w:val="Heading2"/>
+      </w:pPr>
+      <w:r>
+        <w:t>Problemas Encontrados y Soluciones</w:t>
+      </w:r>
+    </w:p>
+    <w:p>
+      <w:pPr>
+        <w:pStyle w:val="ListBullet"/>
+      </w:pPr>
+      <w:r>
+        <w:t>Problema: tsc: not found al hacer build</w:t>
+      </w:r>
+    </w:p>
+    <w:p>
+      <w:pPr>
+        <w:pStyle w:val="ListBullet2"/>
+      </w:pPr>
+      <w:r>
+        <w:t>Causa: pnpm install --prod excluye devDependencies (TypeScript)</w:t>
+      </w:r>
+    </w:p>
+    <w:p>
+      <w:pPr>
+        <w:pStyle w:val="ListBullet2"/>
+      </w:pPr>
+      <w:r>
+        <w:t>Solucion: pnpm install completo, luego pnpm prune --prod</w:t>
+      </w:r>
+    </w:p>
+    <w:p>
+      <w:pPr>
+        <w:pStyle w:val="ListBullet"/>
+      </w:pPr>
+      <w:r>
+        <w:t>Problema: Permission denied en /etc/nginx/</w:t>
+      </w:r>
+    </w:p>
+    <w:p>
+      <w:pPr>
+        <w:pStyle w:val="ListBullet2"/>
+      </w:pPr>
+      <w:r>
+        <w:t>Causa: sudo cat &gt; no funciona porque redirect pierde permisos de sudo</w:t>
+      </w:r>
+    </w:p>
+    <w:p>
+      <w:pPr>
+        <w:pStyle w:val="ListBullet2"/>
+      </w:pPr>
+      <w:r>
+        <w:t>Solucion: Usar sudo tee en lugar de sudo cat &gt;</w:t>
+      </w:r>
+    </w:p>
+    <w:p>
+      <w:pPr>
+        <w:pStyle w:val="ListBullet"/>
+      </w:pPr>
+      <w:r>
+        <w:t>Problema: Certbot creo server block duplicado con return 404</w:t>
+      </w:r>
+    </w:p>
+    <w:p>
+      <w:pPr>
+        <w:pStyle w:val="ListBullet2"/>
+      </w:pPr>
+      <w:r>
+        <w:t>Causa: Certbot agrego server block que interceptaba peticiones</w:t>
+      </w:r>
+    </w:p>
+    <w:p>
+      <w:pPr>
+        <w:pStyle w:val="ListBullet2"/>
+      </w:pPr>
+      <w:r>
+        <w:t>Solucion: Editar config manualmente para tener un solo server block con SSL inline</w:t>
+      </w:r>
+    </w:p>
+    <w:p>
+      <w:pPr>
+        <w:pStyle w:val="ListBullet"/>
+      </w:pPr>
+      <w:r>
+        <w:t>Problema: Error 500 en registro/login</w:t>
+      </w:r>
+    </w:p>
+    <w:p>
+      <w:pPr>
+        <w:pStyle w:val="ListBullet2"/>
+      </w:pPr>
+      <w:r>
+        <w:t>Causa: Archivos JSON tenian estructura incorrecta ([] en lugar de { "users": [] })</w:t>
+      </w:r>
+    </w:p>
+    <w:p>
+      <w:pPr>
+        <w:pStyle w:val="ListBullet2"/>
+      </w:pPr>
+      <w:r>
+        <w:t>Solucion: Crear archivos con estructura correcta que el codigo espera</w:t>
+      </w:r>
+    </w:p>
+    <w:p/>
+    <w:p>
+      <w:pPr>
+        <w:pStyle w:val="Heading2"/>
+      </w:pPr>
+      <w:r>
+        <w:t>Costo Total</w:t>
+      </w:r>
+    </w:p>
+    <w:tbl>
+      <w:tblPr>
+        <w:tblStyle w:val="TableGrid"/>
+        <w:tblW w:type="auto" w:w="0"/>
+        <w:tblLook w:firstColumn="1" w:firstRow="1" w:lastColumn="0" w:lastRow="0" w:noHBand="0" w:noVBand="1" w:val="04A0"/>
+      </w:tblPr>
+      <w:tblGrid>
+        <w:gridCol w:w="3324"/>
+        <w:gridCol w:w="3324"/>
+        <w:gridCol w:w="3324"/>
+      </w:tblGrid>
+      <w:tr>
+        <w:tc>
+          <w:tcPr>
+            <w:tcW w:type="dxa" w:w="3324"/>
+          </w:tcPr>
+          <w:p>
+            <w:r>
+              <w:t>Recurso</w:t>
+            </w:r>
+          </w:p>
+        </w:tc>
+        <w:tc>
+          <w:tcPr>
+            <w:tcW w:type="dxa" w:w="3324"/>
+          </w:tcPr>
+          <w:p>
+            <w:r>
+              <w:t>Free Tier</w:t>
+            </w:r>
+          </w:p>
+        </w:tc>
+        <w:tc>
+          <w:tcPr>
+            <w:tcW w:type="dxa" w:w="3324"/>
+          </w:tcPr>
+          <w:p>
+            <w:r>
+              <w:t>Costo</w:t>
+            </w:r>
+          </w:p>
+        </w:tc>
+      </w:tr>
+      <w:tr>
+        <w:tc>
+          <w:tcPr>
+            <w:tcW w:type="dxa" w:w="3324"/>
+          </w:tcPr>
+          <w:p>
+            <w:r>
+              <w:t>EC2 t3.micro</w:t>
+            </w:r>
+          </w:p>
+        </w:tc>
+        <w:tc>
+          <w:tcPr>
+            <w:tcW w:type="dxa" w:w="3324"/>
+          </w:tcPr>
+          <w:p>
+            <w:r>
+              <w:t>750 hrs/mes (12 meses)</w:t>
+            </w:r>
+          </w:p>
+        </w:tc>
+        <w:tc>
+          <w:tcPr>
+            <w:tcW w:type="dxa" w:w="3324"/>
+          </w:tcPr>
+          <w:p>
+            <w:r>
+              <w:t>$0/mes</w:t>
+            </w:r>
+          </w:p>
+        </w:tc>
+      </w:tr>
+      <w:tr>
+        <w:tc>
+          <w:tcPr>
+            <w:tcW w:type="dxa" w:w="3324"/>
+          </w:tcPr>
+          <w:p>
+            <w:r>
+              <w:t>SSL Let's Encrypt</w:t>
+            </w:r>
+          </w:p>
+        </w:tc>
+        <w:tc>
+          <w:tcPr>
+            <w:tcW w:type="dxa" w:w="3324"/>
+          </w:tcPr>
+          <w:p>
+            <w:r>
+              <w:t>Ilimitado</w:t>
+            </w:r>
+          </w:p>
+        </w:tc>
+        <w:tc>
+          <w:tcPr>
+            <w:tcW w:type="dxa" w:w="3324"/>
+          </w:tcPr>
+          <w:p>
+            <w:r>
+              <w:t>$0</w:t>
+            </w:r>
+          </w:p>
+        </w:tc>
+      </w:tr>
+      <w:tr>
+        <w:tc>
+          <w:tcPr>
+            <w:tcW w:type="dxa" w:w="3324"/>
+          </w:tcPr>
+          <w:p>
+            <w:r>
+              <w:t>Cloudflare DNS</w:t>
+            </w:r>
+          </w:p>
+        </w:tc>
+        <w:tc>
+          <w:tcPr>
+            <w:tcW w:type="dxa" w:w="3324"/>
+          </w:tcPr>
+          <w:p>
+            <w:r>
+              <w:t>Ilimitado</w:t>
+            </w:r>
+          </w:p>
+        </w:tc>
+        <w:tc>
+          <w:tcPr>
+            <w:tcW w:type="dxa" w:w="3324"/>
+          </w:tcPr>
+          <w:p>
+            <w:r>
+              <w:t>$0</w:t>
+            </w:r>
+          </w:p>
+        </w:tc>
+      </w:tr>
+      <w:tr>
+        <w:tc>
+          <w:tcPr>
+            <w:tcW w:type="dxa" w:w="3324"/>
+          </w:tcPr>
+          <w:p>
+            <w:r>
+              <w:t>Dominio peracles.dev</w:t>
+            </w:r>
+          </w:p>
+        </w:tc>
+        <w:tc>
+          <w:tcPr>
+            <w:tcW w:type="dxa" w:w="3324"/>
+          </w:tcPr>
+          <w:p>
+            <w:r>
+              <w:t>Ya existente</w:t>
+            </w:r>
+          </w:p>
+        </w:tc>
+        <w:tc>
+          <w:tcPr>
+            <w:tcW w:type="dxa" w:w="3324"/>
+          </w:tcPr>
+          <w:p>
+            <w:r>
+              <w:t>$0</w:t>
+            </w:r>
+          </w:p>
+        </w:tc>
+      </w:tr>
+    </w:tbl>
+    <w:p/>
+    <w:p>
+      <w:pPr>
+        <w:pStyle w:val="IntenseQuote"/>
+      </w:pPr>
+      <w:r>
+        <w:t>Costo total: $0/mes durante los primeros 12 meses.</w:t>
+      </w:r>
+    </w:p>
     <w:sectPr>
       <w:pgSz w:w="12240" w:h="15840"/>
       <w:pgMar w:top="850" w:right="1134" w:bottom="850" w:left="1134" w:header="720" w:footer="720" w:gutter="0"/>

</xml_diff>

<commit_message>
fix: correct outdated status in respuesta-tecnica.docx
</commit_message>
<xml_diff>
--- a/docs/respuesta-tecnica.docx
+++ b/docs/respuesta-tecnica.docx
@@ -3078,11 +3078,7 @@
           </w:tcPr>
           <w:p>
             <w:r>
-              <w:rPr>
-                <w:rFonts w:ascii="Arial" w:hAnsi="Arial"/>
-                <w:sz w:val="18"/>
-              </w:rPr>
-              <w:t>Pendiente — tarea opcional adicional</w:t>
+              <w:t>Completa — deploy ejecutado en AWS EC2 t3.micro (snail.peracles.dev)</w:t>
             </w:r>
           </w:p>
         </w:tc>

</xml_diff>